<commit_message>
Correct citation metadata and archive release
</commit_message>
<xml_diff>
--- a/paper/PySecPatch_Research_Manuscript.docx
+++ b/paper/PySecPatch_Research_Manuscript.docx
@@ -2318,7 +2318,7 @@
           <w:color w:val="000000"/>
           <w:sz w:val="22"/>
         </w:rPr>
-        <w:t>The release includes source code, model adapter, both dataset stages, split statistics, contamination reports, raw prediction files, paired-comparison code, frozen suite hashes, SALLM shard evidence, package versions, and SHA-256 manifests. GitHub hosts the code and concise reports; Hugging Face hosts the adapter and dataset configurations; an archival deposit provides a versioned DOI. The manuscript, citation metadata, and machine-readable CodeMeta record are distributed with the release.</w:t>
+        <w:t>The release includes source code, model adapter, both dataset stages, split statistics, contamination reports, raw prediction files, paired-comparison code, frozen suite hashes, SALLM shard evidence, package versions, and SHA-256 manifests. GitHub hosts the code and concise reports; Hugging Face hosts the adapter and dataset configurations. Zenodo concept DOI 10.5281/zenodo.21015503 resolves to the latest archived software release, while version DOI 10.5281/zenodo.21015504 identifies the initial v0.1.0 snapshot [13]. The manuscript, citation metadata, and machine-readable CodeMeta record are distributed with the release.</w:t>
       </w:r>
     </w:p>
     <w:p>
@@ -2504,6 +2504,19 @@
           <w:sz w:val="22"/>
         </w:rPr>
         <w:t>[12] M. Souppaya, K. Scarfone, and D. Dodson. “Secure Software Development Framework (SSDF) Version 1.1.” NIST SP 800-218, 2022. DOI: 10.6028/NIST.SP.800-218.</w:t>
+      </w:r>
+    </w:p>
+    <w:p>
+      <w:pPr>
+        <w:widowControl/>
+      </w:pPr>
+      <w:r>
+        <w:rPr>
+          <w:rFonts w:ascii="Times New Roman" w:hAnsi="Times New Roman"/>
+          <w:color w:val="000000"/>
+          <w:sz w:val="22"/>
+        </w:rPr>
+        <w:t>[13] A. Bin Khalid. "PySecPatch: Defensive Python Vulnerability Triage and Repair Research Artifacts." Zenodo, 2026. DOI: 10.5281/zenodo.21015503.</w:t>
       </w:r>
     </w:p>
     <w:sectPr>

</xml_diff>

<commit_message>
Add canonical dataset DOI
</commit_message>
<xml_diff>
--- a/paper/PySecPatch_Research_Manuscript.docx
+++ b/paper/PySecPatch_Research_Manuscript.docx
@@ -2318,7 +2318,7 @@
           <w:color w:val="000000"/>
           <w:sz w:val="22"/>
         </w:rPr>
-        <w:t>The release includes source code, model adapter, both dataset stages, split statistics, contamination reports, raw prediction files, paired-comparison code, frozen suite hashes, SALLM shard evidence, package versions, and SHA-256 manifests. GitHub hosts the code and concise reports; Hugging Face hosts the adapter and dataset configurations. Zenodo concept DOI 10.5281/zenodo.21015503 resolves to the latest archived software release, while version DOI 10.5281/zenodo.21015504 identifies the initial v0.1.0 snapshot [13]. The manuscript, citation metadata, and machine-readable CodeMeta record are distributed with the release.</w:t>
+        <w:t>The release includes source code, model adapter, both dataset stages, split statistics, contamination reports, raw prediction files, paired-comparison code, frozen suite hashes, SALLM shard evidence, package versions, and SHA-256 manifests. GitHub hosts the code and concise reports; Hugging Face hosts the adapter and dataset configurations. Zenodo concept DOI 10.5281/zenodo.21015503 resolves to the latest archived software release [13]. The independently archived PySecPatch-72K dataset is identified by DOI 10.5281/zenodo.21016753 [14]. The manuscript, citation metadata, and machine-readable CodeMeta record are distributed with the release.</w:t>
       </w:r>
     </w:p>
     <w:p>
@@ -2517,6 +2517,19 @@
           <w:sz w:val="22"/>
         </w:rPr>
         <w:t>[13] A. Bin Khalid. "PySecPatch: Defensive Python Vulnerability Triage and Repair Research Artifacts." Zenodo, 2026. DOI: 10.5281/zenodo.21015503.</w:t>
+      </w:r>
+    </w:p>
+    <w:p>
+      <w:pPr>
+        <w:widowControl/>
+      </w:pPr>
+      <w:r>
+        <w:rPr>
+          <w:rFonts w:ascii="Times New Roman" w:hAnsi="Times New Roman"/>
+          <w:color w:val="000000"/>
+          <w:sz w:val="22"/>
+        </w:rPr>
+        <w:t>[14] A. Bin Khalid. "PySecPatch-72K: A Family-Disjoint Python Security Triage and Repair Corpus." Zenodo, 2026. DOI: 10.5281/zenodo.21016753.</w:t>
       </w:r>
     </w:p>
     <w:sectPr>

</xml_diff>